<commit_message>
Draw Figures 1 and 2 at their printed size, and drop the deliverables sync scripts
Figures 1 and 2 were drawn 23 and 21.5 in wide, so Word's 6.69 in text width printed
their labels at 3 to 4 pt. Both are now drawn at 6.69 in with point sizes that reach
the page: figure 1 at 6.3 in tall with group names wrapped at 24 characters, category
names at 16 and the right-edge tick dropped where it ran into the next panel's zero;
figure 2 at 6.4 in with category-only strips. The remainder bar reads "All other pairs",
because "Remaining regions and sector pairs" was the widest label; Figs. A.2 to A.4 are
re-rendered with the same wording. Both documents carry the new images, and the response
letters say the main-text figures are drawn at the width they print.

The two deliverables scripts are removed: they were one-time helpers. The submission
readme now says which versioned file each package file copies, and .gitignore still
keeps deliverables/ out of git.
</commit_message>
<xml_diff>
--- a/docs/eriksen_et_al_2026/eriksen_et_al_2026_manuscript.docx
+++ b/docs/eriksen_et_al_2026/eriksen_et_al_2026_manuscript.docx
@@ -9016,7 +9016,7 @@
         </w:rPr>
         <w:drawing>
           <wp:inline distT="0" distB="0" distL="0" distR="0" wp14:anchorId="6A2B7581" wp14:editId="1C61ABEF">
-            <wp:extent cx="6116955" cy="3856740"/>
+            <wp:extent cx="6116955" cy="5760133"/>
             <wp:effectExtent l="0" t="0" r="0" b="6350"/>
             <wp:docPr id="93734683" name="Picture 2"/>
             <wp:cNvGraphicFramePr>
@@ -9047,7 +9047,7 @@
                   <pic:spPr bwMode="auto">
                     <a:xfrm>
                       <a:off x="0" y="0"/>
-                      <a:ext cx="6116955" cy="3856740"/>
+                      <a:ext cx="6116955" cy="5760133"/>
                     </a:xfrm>
                     <a:prstGeom prst="rect">
                       <a:avLst/>
@@ -9641,7 +9641,7 @@
         </w:rPr>
         <w:drawing>
           <wp:inline distT="0" distB="0" distL="0" distR="0" wp14:anchorId="52E089D1" wp14:editId="515A9DB9">
-            <wp:extent cx="6116955" cy="3553951"/>
+            <wp:extent cx="6116955" cy="5851887"/>
             <wp:effectExtent l="0" t="0" r="2540" b="1270"/>
             <wp:docPr id="851368838" name="Picture 3"/>
             <wp:cNvGraphicFramePr>
@@ -9672,7 +9672,7 @@
                   <pic:spPr bwMode="auto">
                     <a:xfrm>
                       <a:off x="0" y="0"/>
-                      <a:ext cx="6116955" cy="3553951"/>
+                      <a:ext cx="6116955" cy="5851887"/>
                     </a:xfrm>
                     <a:prstGeom prst="rect">
                       <a:avLst/>

</xml_diff>

<commit_message>
Drop the redundant "consumption-based" before footprint, and the images appendix A no longer shows
A footprint is consumption-based by definition. The qualifier is removed from five
places in the manuscript and six in appendix A, all inside Albert Kwame Osei-Owusu's
own tracked insertions, so no new layer of marks is added. Appendix A drops four
superseded figure images (1.2 MB) it still packaged. Word renders both documents
unchanged (17 and 24 pages); tracked insertions and deletions are unchanged in number.
Logged under "Findings of 3 October 2026" in docs/revision/defects_and_fixes.md.
</commit_message>
<xml_diff>
--- a/docs/eriksen_et_al_2026/eriksen_et_al_2026_manuscript.docx
+++ b/docs/eriksen_et_al_2026/eriksen_et_al_2026_manuscript.docx
@@ -67,7 +67,7 @@
       </w:del>
       <w:ins w:id="10873" w:author="Albert Kwame Osei-Owusu" w:date="2026-09-14T09:00:00Z">
         <w:r>
-          <w:t xml:space="preserve">Health care relies on energy and materials whose environmental impacts cross global supply chains and escape facility-level assessment. We quantified those impacts for Denmark in 2022 using environmentally extended multi-regional input-output analysis with bottom-up complements. Demand was built from Statistics Denmark's published 117-industry input-output table, with distribution margins assigned to the trade industries, and linked to global supply chains through EXIOBASE version 3.8.2; because demand and model years coincided, no deflation was required. Parameter uncertainty was propagated by Monte Carlo simulation with 100,000 draws. Danish health care was associated with 4,267 kilotonnes of carbon dioxide equivalent (95% uncertainty interval 3,675 to 5,029 kilotonnes), 5.5% of the national consumption-based footprint; 3,498 kilotonnes of material extraction (6.5%); 75 million cubic metres of blue water (5.9%); 4,118 square kilometres of land use (4.1%); and 221 kilotonnes of waste (2.1%). Pharmaceuticals and chemical products were the largest contributor to the climate footprint, at 27.1% (95% interval 24.2% to 29.0%; first in 96.6% of draws), and to material extraction, blue water consumption and waste generation; food led land use. Supply-chain transport contributed 13.3% of the climate footprint, against 29.7% uncorrected, because EXIOBASE allocates 74% of Danish sea-transport output to Danish intermediate use, against 6.5% in Statistics Denmark's table. Blue water consumption and land use occurred predominantly outside Denmark and Europe. Most of the interval width came from the input-output data rather than the Danish primary data. Mitigation must reach beyond health care facilities to procurement, pharmaceutical supply, travel and food systems.</w:t>
+          <w:t xml:space="preserve">Health care relies on energy and materials whose environmental impacts cross global supply chains and escape facility-level assessment. We quantified those impacts for Denmark in 2022 using environmentally extended multi-regional input-output analysis with bottom-up complements. Demand was built from Statistics Denmark's published 117-industry input-output table, with distribution margins assigned to the trade industries, and linked to global supply chains through EXIOBASE version 3.8.2; because demand and model years coincided, no deflation was required. Parameter uncertainty was propagated by Monte Carlo simulation with 100,000 draws. Danish health care was associated with 4,267 kilotonnes of carbon dioxide equivalent (95% uncertainty interval 3,675 to 5,029 kilotonnes), 5.5% of the national footprint; 3,498 kilotonnes of material extraction (6.5%); 75 million cubic metres of blue water (5.9%); 4,118 square kilometres of land use (4.1%); and 221 kilotonnes of waste (2.1%). Pharmaceuticals and chemical products were the largest contributor to the climate footprint, at 27.1% (95% interval 24.2% to 29.0%; first in 96.6% of draws), and to material extraction, blue water consumption and waste generation; food led land use. Supply-chain transport contributed 13.3% of the climate footprint, against 29.7% uncorrected, because EXIOBASE allocates 74% of Danish sea-transport output to Danish intermediate use, against 6.5% in Statistics Denmark's table. Blue water consumption and land use occurred predominantly outside Denmark and Europe. Most of the interval width came from the input-output data rather than the Danish primary data. Mitigation must reach beyond health care facilities to procurement, pharmaceutical supply, travel and food systems.</w:t>
         </w:r>
       </w:ins>
     </w:p>
@@ -2886,7 +2886,7 @@
       </w:del>
       <w:ins w:id="3180" w:author="Albert Kwame Osei-Owusu" w:date="2026-09-13T09:00:00Z">
         <w:r>
-          <w:t xml:space="preserve">We estimated the consumption-based environmental footprint of Danish health care in 2022 with an EE-MRIO model supplemented by bottom-up estimates for sources that monetary accounts represent poorly. The supplement is additive: the bottom-up terms are added to the model result rather than integrated into a hybrid technology matrix. </w:t>
+          <w:t xml:space="preserve">We estimated the environmental footprint of Danish health care in 2022 with an EE-MRIO model supplemented by bottom-up estimates for sources that monetary accounts represent poorly. The supplement is additive: the bottom-up terms are added to the model result rather than integrated into a hybrid technology matrix. </w:t>
         </w:r>
       </w:ins>
       <w:ins w:id="3181" w:author="Albert Kwame Osei-Owusu" w:date="2026-09-13T09:00:00Z">
@@ -6187,7 +6187,7 @@
       </w:ins>
       <w:ins w:id="2292" w:author="Albert Kwame Osei-Owusu" w:date="2026-09-13T09:00:00Z">
         <w:r>
-          <w:t xml:space="preserve">, and the partition is applied to the other four indicators. Shares of the national total are taken against Denmark's consumption-based footprint on the same corrected background and characterisation; because </w:t>
+          <w:t xml:space="preserve">, and the partition is applied to the other four indicators. Shares of the national total are taken against Denmark's footprint on the same corrected background and characterisation; because </w:t>
         </w:r>
       </w:ins>
       <w:ins w:id="2293" w:author="Albert Kwame Osei-Owusu" w:date="2026-09-13T09:00:00Z">
@@ -10231,7 +10231,7 @@
       </w:ins>
       <w:ins w:id="2664" w:author="Albert Kwame Osei-Owusu" w:date="2026-09-12T09:00:00Z">
         <w:r>
-          <w:t xml:space="preserve"> of the national consumption-based footprint.</w:t>
+          <w:t xml:space="preserve"> of the national footprint.</w:t>
         </w:r>
       </w:ins>
     </w:p>
@@ -12810,7 +12810,7 @@
       </w:del>
       <w:ins w:id="24915" w:author="Albert Kwame Osei-Owusu" w:date="2026-09-14T09:00:00Z">
         <w:r>
-          <w:t xml:space="preserve">This study provides a systemic assessment of the environmental impacts associated with delivering health care in Denmark, using an EE-MRIO framework complemented by selected bottom-up calculations. Danish health care accounts for between 2.1% and 6.5% of the national consumption-based footprint across the five categories, and for 0.73 t CO₂e per person per year in greenhouse gas emissions.</w:t>
+          <w:t xml:space="preserve">This study provides a systemic assessment of the environmental impacts associated with delivering health care in Denmark, using an EE-MRIO framework complemented by selected bottom-up calculations. Danish health care accounts for between 2.1% and 6.5% of the national footprint across the five categories, and for 0.73 t CO₂e per person per year in greenhouse gas emissions.</w:t>
         </w:r>
       </w:ins>
     </w:p>

</xml_diff>

<commit_message>
Close the second audit round: safe-side benchmark ceiling, exact variance share, and letters aligned
The fact re-gate traced ~340 claims afresh; two sentences needed correction. The
benchmark match is 2.544% below Schmidt and Merciai, so "within 2.5%" becomes
"within 3%" in the manuscript and Appendix A. The travel terms and their
covariance account for 30.3% of the climate variance, not 30.4%, in the
manuscript, all three letters and the quoted revised passage. The response
letter also reads "Applied to the 2019 table", "sulphur" in prose, and drops a
colon before an explanatory clause; the co-author letter states the journal's
actual length ruling (no formal limit, abstract capped at 250 words) against
the measured 7,400 words. Citation order holds at 1..51 and 1..36, all 17
quoted passages match the accepted text, the abstract stays at 249 words, and
the consistency audit passes 21 of 21.
</commit_message>
<xml_diff>
--- a/docs/eriksen_et_al_2026/eriksen_et_al_2026_manuscript.docx
+++ b/docs/eriksen_et_al_2026/eriksen_et_al_2026_manuscript.docx
@@ -5139,7 +5139,13 @@
           <w:t xml:space="preserve">6.5%</w:t>
         </w:r>
         <w:r>
-          <w:t xml:space="preserve"> for 2022). Read from the 2019 table, the same procedure returns </w:t>
+          <w:t xml:space="preserve"> for 2022). </w:t>
+        </w:r>
+        <w:r>
+          <w:t xml:space="preserve">Applied to</w:t>
+        </w:r>
+        <w:r>
+          <w:t xml:space="preserve"> the 2019 table, the same procedure returns </w:t>
         </w:r>
         <w:r>
           <w:t xml:space="preserve">9.3%,</w:t>
@@ -6244,7 +6250,13 @@
           <w:t xml:space="preserve"> Modelling decisions rather than measurement errors </w:t>
         </w:r>
         <w:r>
-          <w:t xml:space="preserve">(the pharmaceutical mapping, the composition of the services purchases, the valuation of distribution margins, the sea-transport target share, the health care boundary, capital treatment and the GWP revision) are reported as sensitivity cases alongside the interval (Appendix A, Sensitivity; each case in Table A.7).</w:t>
+          <w:t xml:space="preserve">(the pharmaceutical mapping, the composition of the services purchases, the valuation of distribution margins, the sea-transport target share, the health care boundary, </w:t>
+        </w:r>
+        <w:r>
+          <w:t xml:space="preserve">the </w:t>
+        </w:r>
+        <w:r>
+          <w:t xml:space="preserve">capital treatment and the GWP revision) are reported as sensitivity cases alongside the interval (Appendix A, Sensitivity; each case in Table A.7).</w:t>
         </w:r>
       </w:ins>
     </w:p>
@@ -6824,7 +6836,19 @@
           <w:t xml:space="preserve">. </w:t>
         </w:r>
         <w:r>
-          <w:t xml:space="preserve">Greenhouse gas emissions are also partitioned following the Greenhouse Gas (GHG) Protocol [44], within the input-output scope framework of Hertwich and Wood [45]. Scope 1 is the DRIVHUS term plus anaesthetic gases. Scope 2 comprises the emissions from generating the electricity and heat the health sector buys, traced through transmission and distribution within the energy block (Appendix A, Eq. (A.16)); this is the corporate standard’s boundary, narrower than Hertwich and Wood’s embodied-energy convention. Scope 3 is the remainder, computed as the partition total minus Scopes 1 and 2, so that the three scopes and patient and visitor travel sum to that total without double counting, which we verified with the target-sector method of Cabernard and colleagues [46] (Appendix A, Double counting).</w:t>
+          <w:t xml:space="preserve">Greenhouse gas emissions are also partitioned following the Greenhouse Gas (GHG) Protocol [44], within the input-output scope framework of Hertwich and Wood [45]. Scope 1 is the DRIVHUS term plus anaesthetic gases. Scope 2 comprises the emissions from generating the electricity and heat the health sector buys, traced through transmission and distribution within the energy block (Appendix A, Eq. (A.16)); this is the corporate standard’s boundary, narrower than Hertwich and Wood’s embodied-energy convention. Scope 3 is the remainder, computed as the partition total minus Scopes 1 and </w:t>
+        </w:r>
+        <w:r>
+          <w:t xml:space="preserve">2</w:t>
+        </w:r>
+        <w:r>
+          <w:t xml:space="preserve"> and patient and visitor </w:t>
+        </w:r>
+        <w:r>
+          <w:t xml:space="preserve">travel, so that the four parts</w:t>
+        </w:r>
+        <w:r>
+          <w:t xml:space="preserve"> sum to that total without double counting, which we verified with the target-sector method of Cabernard and colleagues [46] (Appendix A, Double counting).</w:t>
         </w:r>
       </w:ins>
       <w:ins w:id="2290" w:author="Albert Kwame Osei-Owusu" w:date="2026-09-13T09:00:00Z">
@@ -13946,7 +13970,7 @@
         <w:rPr/>
         <w:t xml:space="preserve">Limitations</w:t>
       </w:r>
-      <w:ins w:id="52485" w:author="Albert Kwame Osei-Owusu" w:date="2026-10-21T20:00:00Z">
+      <w:ins w:id="52487" w:author="Albert Kwame Osei-Owusu" w:date="2026-10-21T20:00:00Z">
         <w:r>
           <w:rPr/>
           <w:t xml:space="preserve"> and uncertainties</w:t>
@@ -13988,7 +14012,31 @@
           <w:t xml:space="preserve"> </w:t>
         </w:r>
         <w:r>
-          <w:t xml:space="preserve">The re-weighting changes only this study’s demand vector, as NHS England composes its demand from national procurement statistics [14], and leaves the balanced global table untouched; correcting the table itself has no published precedent short of rebuilding the whole country block from the national accounts, as Statistics Denmark’s coupled model does [28]. We nevertheless keep the headline on the published column, because the correction fails three tests. At the Chemicals n.e.c. intensity it fails a structural test, because pharmaceuticals and chemical products would then carry 78% of blue water consumption, against 42.9% in the Dutch results [13]. At a pharmaceutical-specific intensity of about one third of the chemicals intensity for climate change, as reported for the Netherlands [13,17], it reverses sign, so the correction bounds the climate footprint between 3,933 and 5,635 kt CO₂e rather than identifying it, and no such ratio exists for the other categories. And matched to the boundary and capital treatment of the closest Danish comparator (Appendix A, Validation against published Danish footprints), the published column lies within 2.5% of its figure, whereas the chemicals-intensity correction overshoots it by 25% and the pharmaceutical-intensity correction undershoots it by 9%. A Danish rebuild of the database from the national accounts would resolve this and the column’s other divergences at once, and is future work.</w:t>
+          <w:t xml:space="preserve">The re-weighting changes only this study’s demand vector, as NHS England composes its demand from national procurement statistics [14], and leaves the balanced global table untouched; correcting the table itself has no published precedent short of rebuilding the whole country block from the national accounts, as Statistics Denmark’s coupled model does [28]. We nevertheless keep the headline on the published column, because the correction fails three tests. At the Chemicals n.e.c. intensity it fails a structural test, because pharmaceuticals and chemical products would then carry 78% of blue water consumption, against 42.9% in the Dutch results [13]. At a pharmaceutical-specific intensity of about one third of the chemicals intensity for climate change, as reported for the Netherlands [13,17], it reverses sign, so the correction bounds the climate footprint between 3,933 and 5,635 kt CO₂e rather than identifying </w:t>
+        </w:r>
+        <w:r>
+          <w:t xml:space="preserve">it; reported ratios exist only for climate change</w:t>
+        </w:r>
+        <w:r>
+          <w:t xml:space="preserve"> and </w:t>
+        </w:r>
+        <w:r>
+          <w:t xml:space="preserve">material extraction, not</w:t>
+        </w:r>
+        <w:r>
+          <w:t xml:space="preserve"> for </w:t>
+        </w:r>
+        <w:r>
+          <w:t xml:space="preserve">blue water consumption, land use or waste generation.</w:t>
+        </w:r>
+        <w:r>
+          <w:t xml:space="preserve"> </w:t>
+        </w:r>
+        <w:r>
+          <w:t xml:space="preserve">Matched to the boundary and capital treatment of the closest Danish comparator (Appendix A, Validation against published Danish footprints), the published column lies within 3% of its figure, whereas the chemicals-intensity correction overshoots it by 25% and the pharmaceutical-intensity correction undershoots it by 9%; the comparison checks structure rather than the exact figure, but only the published column stays within a few per cent of it.</w:t>
+        </w:r>
+        <w:r>
+          <w:t xml:space="preserve"> A Danish rebuild of the database from the national accounts would resolve this and the column’s other divergences at once, and is future work.</w:t>
         </w:r>
         <w:r>
           <w:t xml:space="preserve"> Distribution margins on medicines and appliances are charged at the intensity of the Danish trade industries; charging them at the manufacturing intensity, as a whole-column mapping does, would increase the climate footprint by </w:t>
@@ -14004,6 +14052,9 @@
     <w:p>
       <w:pPr>
         <w:spacing w:after="160"/>
+        <w:rPr>
+          <w:ins w:id="52486" w:author="Albert Kwame Osei-Owusu" w:date="2026-10-21T20:00:00Z"/>
+        </w:rPr>
       </w:pPr>
       <w:del w:id="928" w:author="Albert Kwame Osei-Owusu" w:date="2026-09-12T09:00:00Z">
         <w:r>
@@ -14082,7 +14133,17 @@
           <w:t xml:space="preserve">Future studies should bring capital into the boundary once capital matrices for 2022 are published.</w:t>
         </w:r>
         <w:r>
-          <w:t xml:space="preserve"> Material extraction adds tonnes without weighting, and input-output analysis assumes that physical flows are proportional to spending, which matters most where prices per tonne are </w:t>
+          <w:t xml:space="preserve"> </w:t>
+        </w:r>
+      </w:ins>
+    </w:p>
+    <w:p>
+      <w:pPr>
+        <w:spacing w:after="160"/>
+      </w:pPr>
+      <w:ins w:id="52485" w:author="Albert Kwame Osei-Owusu" w:date="2026-10-21T20:00:00Z">
+        <w:r>
+          <w:t xml:space="preserve">Material extraction adds tonnes without weighting, and input-output analysis assumes that physical flows are proportional to spending, which matters most where prices per tonne are </w:t>
         </w:r>
         <w:r>
           <w:t xml:space="preserve">lowest, as the</w:t>
@@ -14139,7 +14200,28 @@
       </w:del>
       <w:ins w:id="52425" w:author="Albert Kwame Osei-Owusu" w:date="2026-10-21T20:00:00Z">
         <w:r>
-          <w:t xml:space="preserve">The bottom-up terms rest mainly on Danish sources, the National Inventory Document, the register of medicine sales and the National Travel Survey, but the travel terms transfer the Dutch emission intensity per kilometre, which the Danish car fleet, with its growing share of electric cars, may not match, and the visitor share from NHS England. With their covariance, these terms account for 30.4% of the variance of the climate footprint, </w:t>
+          <w:t xml:space="preserve">The bottom-up terms rest mainly on Danish sources, the National Inventory Document, the register of medicine sales and the National Travel Survey, but the travel terms transfer the Dutch emission intensity per kilometre, which the Danish car fleet, with its growing share of electric cars, may not match, and the visitor share from NHS England. </w:t>
+        </w:r>
+        <w:r>
+          <w:t xml:space="preserve">The two travel terms and</w:t>
+        </w:r>
+        <w:r>
+          <w:t xml:space="preserve"> their </w:t>
+        </w:r>
+        <w:r>
+          <w:t xml:space="preserve">covariance</w:t>
+        </w:r>
+        <w:r>
+          <w:t xml:space="preserve"> account for </w:t>
+        </w:r>
+        <w:r>
+          <w:t xml:space="preserve">30.3%</w:t>
+        </w:r>
+        <w:r>
+          <w:t xml:space="preserve"> of the variance of the climate footprint, </w:t>
+        </w:r>
+        <w:r>
+          <w:t xml:space="preserve">and the gas terms for almost none, </w:t>
         </w:r>
         <w:r>
           <w:t xml:space="preserve">compared to</w:t>

</xml_diff>

<commit_message>
Restore the first author's own AI statement verbatim
The declaration body returns to Ofir Eriksen's wording from his revised
manuscript, as a tracked change, under the journal's required section title;
only the final full stop is added. The letter to him now says the statement
stands as he wrote it. Citation order, quoted passages and the shared-folder
hashes all verified after the rebuild.
</commit_message>
<xml_diff>
--- a/docs/eriksen_et_al_2026/eriksen_et_al_2026_manuscript.docx
+++ b/docs/eriksen_et_al_2026/eriksen_et_al_2026_manuscript.docx
@@ -13970,7 +13970,7 @@
         <w:rPr/>
         <w:t xml:space="preserve">Limitations</w:t>
       </w:r>
-      <w:ins w:id="52487" w:author="Albert Kwame Osei-Owusu" w:date="2026-10-21T20:00:00Z">
+      <w:ins w:id="52488" w:author="Albert Kwame Osei-Owusu" w:date="2026-10-21T20:00:00Z">
         <w:r>
           <w:rPr/>
           <w:t xml:space="preserve"> and uncertainties</w:t>
@@ -14972,9 +14972,9 @@
           <w:delText>The authors used large language models (primarily Microsoft Copilot) to assist with grammar, spelling, language clarity, and code comprehension. AI tools were used to help interpret and explain existing code and to support programming tasks. All AI-generated suggestions, text revisions, and coding outputs were critically reviewed, validated, and, where appropriate, modified by the authors. The authors take full responsibility for all analyses, code, results, interpretations, and conclusions presented in the manuscript</w:delText>
         </w:r>
       </w:del>
-      <w:ins w:id="8375" w:author="Albert Kwame Osei-Owusu" w:date="2026-09-14T09:00:00Z">
-        <w:r>
-          <w:t xml:space="preserve">During the preparation of this work the authors used Microsoft Copilot and Claude (Anthropic) in order to improve grammar, spelling and language clarity, to help interpret, write and test analysis code, and to check reported numbers and references against the result files and the cited sources. After using these tools, the authors critically reviewed, validated and edited all suggestions, text and code as needed, and take full responsibility for the analyses, code, results, interpretations and conclusions of the published article.</w:t>
+      <w:ins w:id="52487" w:author="Albert Kwame Osei-Owusu" w:date="2026-10-21T20:00:00Z">
+        <w:r>
+          <w:t xml:space="preserve">The authors used large language models (primarily Microsoft Copilot) to assist with grammar, spelling, language clarity, and code comprehension. AI tools were used to help interpret and explain existing code and to support programming tasks. All AI-generated suggestions, text revisions, and coding outputs were critically reviewed, validated, and, where appropriate, modified by the authors. The authors take full responsibility for all analyses, code, results, interpretations, and conclusions presented in the manuscript.</w:t>
         </w:r>
       </w:ins>
     </w:p>

</xml_diff>